<commit_message>
Fix 1: System Draft
</commit_message>
<xml_diff>
--- a/Report05.docx
+++ b/Report05.docx
@@ -4,21 +4,24 @@
   <w:body>
     <w:p>
       <w:pPr>
-        <w:rPr>
-          <w:lang w:val="vi-VN"/>
-        </w:rPr>
-      </w:pPr>
-    </w:p>
-    <w:p>
-      <w:pPr>
         <w:pBdr>
           <w:top w:val="dotted" w:sz="24" w:space="1" w:color="auto"/>
           <w:bottom w:val="dotted" w:sz="24" w:space="1" w:color="auto"/>
         </w:pBdr>
         <w:rPr>
-          <w:lang w:val="vi-VN"/>
-        </w:rPr>
-      </w:pPr>
+          <w:sz w:val="28"/>
+          <w:szCs w:val="28"/>
+          <w:lang w:val="vi-VN"/>
+        </w:rPr>
+      </w:pPr>
+      <w:r>
+        <w:rPr>
+          <w:sz w:val="28"/>
+          <w:szCs w:val="28"/>
+          <w:lang w:val="vi-VN"/>
+        </w:rPr>
+        <w:t>202419016</w:t>
+      </w:r>
     </w:p>
     <w:p>
       <w:pPr>
@@ -27,28 +30,15 @@
           <w:bottom w:val="dotted" w:sz="24" w:space="1" w:color="auto"/>
         </w:pBdr>
         <w:rPr>
-          <w:lang w:val="vi-VN"/>
-        </w:rPr>
-      </w:pPr>
-      <w:r>
-        <w:rPr>
-          <w:lang w:val="vi-VN"/>
-        </w:rPr>
-        <w:t>202419016</w:t>
-      </w:r>
-    </w:p>
-    <w:p>
-      <w:pPr>
-        <w:pBdr>
-          <w:top w:val="dotted" w:sz="24" w:space="1" w:color="auto"/>
-          <w:bottom w:val="dotted" w:sz="24" w:space="1" w:color="auto"/>
-        </w:pBdr>
-        <w:rPr>
-          <w:lang w:val="vi-VN"/>
-        </w:rPr>
-      </w:pPr>
-      <w:r>
-        <w:rPr>
+          <w:sz w:val="28"/>
+          <w:szCs w:val="28"/>
+          <w:lang w:val="vi-VN"/>
+        </w:rPr>
+      </w:pPr>
+      <w:r>
+        <w:rPr>
+          <w:sz w:val="28"/>
+          <w:szCs w:val="28"/>
           <w:lang w:val="vi-VN"/>
         </w:rPr>
         <w:t>Phạm Xuân Việt</w:t>
@@ -56,44 +46,16 @@
     </w:p>
     <w:p>
       <w:pPr>
-        <w:pBdr>
-          <w:top w:val="dotted" w:sz="24" w:space="1" w:color="auto"/>
-          <w:bottom w:val="dotted" w:sz="24" w:space="1" w:color="auto"/>
-        </w:pBdr>
-        <w:rPr>
-          <w:lang w:val="vi-VN"/>
-        </w:rPr>
-      </w:pPr>
-    </w:p>
-    <w:p>
-      <w:pPr>
-        <w:rPr>
-          <w:lang w:val="vi-VN"/>
-        </w:rPr>
-      </w:pPr>
-    </w:p>
-    <w:p>
-      <w:pPr>
-        <w:rPr>
-          <w:lang w:val="vi-VN"/>
-        </w:rPr>
-      </w:pPr>
-    </w:p>
-    <w:p>
-      <w:pPr>
-        <w:rPr>
-          <w:lang w:val="vi-VN"/>
-        </w:rPr>
-      </w:pPr>
-    </w:p>
-    <w:p>
-      <w:pPr>
-        <w:rPr>
-          <w:lang w:val="vi-VN"/>
-        </w:rPr>
-      </w:pPr>
-      <w:r>
-        <w:rPr>
+        <w:rPr>
+          <w:sz w:val="28"/>
+          <w:szCs w:val="28"/>
+          <w:lang w:val="vi-VN"/>
+        </w:rPr>
+      </w:pPr>
+      <w:r>
+        <w:rPr>
+          <w:sz w:val="28"/>
+          <w:szCs w:val="28"/>
           <w:lang w:val="vi-VN"/>
         </w:rPr>
         <w:t>OOP</w:t>
@@ -102,11 +64,64 @@
     <w:p>
       <w:pPr>
         <w:rPr>
-          <w:lang w:val="vi-VN"/>
-        </w:rPr>
-      </w:pPr>
-      <w:r>
-        <w:rPr>
+          <w:sz w:val="28"/>
+          <w:szCs w:val="28"/>
+          <w:lang w:val="vi-VN"/>
+        </w:rPr>
+      </w:pPr>
+      <w:hyperlink r:id="rId4" w:history="1">
+        <w:r>
+          <w:rPr>
+            <w:rStyle w:val="Hyperlink"/>
+            <w:sz w:val="28"/>
+            <w:szCs w:val="28"/>
+            <w:lang w:val="vi-VN"/>
+          </w:rPr>
+          <w:t>https://chatgpt.com/share/6acbb596-729c-83ec-9eb0-6eef854ec805</w:t>
+        </w:r>
+      </w:hyperlink>
+    </w:p>
+    <w:p>
+      <w:pPr>
+        <w:rPr>
+          <w:sz w:val="28"/>
+          <w:szCs w:val="28"/>
+          <w:lang w:val="vi-VN"/>
+        </w:rPr>
+      </w:pPr>
+      <w:hyperlink r:id="rId5" w:history="1">
+        <w:r>
+          <w:rPr>
+            <w:rStyle w:val="Hyperlink"/>
+            <w:sz w:val="28"/>
+            <w:szCs w:val="28"/>
+            <w:lang w:val="vi-VN"/>
+          </w:rPr>
+          <w:t>https://chatgpt.com/share/6acbb5ba-f6fc-83ec-b4db-c7bcc7e7a396</w:t>
+        </w:r>
+      </w:hyperlink>
+    </w:p>
+    <w:p>
+      <w:pPr>
+        <w:rPr>
+          <w:sz w:val="28"/>
+          <w:szCs w:val="28"/>
+          <w:lang w:val="vi-VN"/>
+        </w:rPr>
+      </w:pPr>
+    </w:p>
+    <w:p>
+      <w:pPr>
+        <w:rPr>
+          <w:sz w:val="28"/>
+          <w:szCs w:val="28"/>
+          <w:lang w:val="vi-VN"/>
+        </w:rPr>
+      </w:pPr>
+      <w:r>
+        <w:rPr>
+          <w:sz w:val="28"/>
+          <w:szCs w:val="28"/>
           <w:lang w:val="vi-VN"/>
         </w:rPr>
         <w:t>Bài 5</w:t>
@@ -115,11 +130,15 @@
     <w:p>
       <w:pPr>
         <w:rPr>
-          <w:lang w:val="vi-VN"/>
-        </w:rPr>
-      </w:pPr>
-      <w:r>
-        <w:rPr>
+          <w:sz w:val="28"/>
+          <w:szCs w:val="28"/>
+          <w:lang w:val="vi-VN"/>
+        </w:rPr>
+      </w:pPr>
+      <w:r>
+        <w:rPr>
+          <w:sz w:val="28"/>
+          <w:szCs w:val="28"/>
           <w:lang w:val="vi-VN"/>
         </w:rPr>
         <w:t>1.</w:t>
@@ -128,11 +147,15 @@
     <w:p>
       <w:pPr>
         <w:rPr>
-          <w:lang w:val="vi-VN"/>
-        </w:rPr>
-      </w:pPr>
-      <w:r>
-        <w:rPr>
+          <w:sz w:val="28"/>
+          <w:szCs w:val="28"/>
+          <w:lang w:val="vi-VN"/>
+        </w:rPr>
+      </w:pPr>
+      <w:r>
+        <w:rPr>
+          <w:sz w:val="28"/>
+          <w:szCs w:val="28"/>
           <w:lang w:val="vi-VN"/>
         </w:rPr>
         <w:t>Yêu cầu nghiệp vụ:</w:t>
@@ -141,11 +164,15 @@
     <w:p>
       <w:pPr>
         <w:rPr>
-          <w:lang w:val="vi-VN"/>
-        </w:rPr>
-      </w:pPr>
-      <w:r>
-        <w:rPr>
+          <w:sz w:val="28"/>
+          <w:szCs w:val="28"/>
+          <w:lang w:val="vi-VN"/>
+        </w:rPr>
+      </w:pPr>
+      <w:r>
+        <w:rPr>
+          <w:sz w:val="28"/>
+          <w:szCs w:val="28"/>
           <w:lang w:val="vi-VN"/>
         </w:rPr>
         <w:t xml:space="preserve">Quản lý thiết bị trong trường đại học để bảo trì. </w:t>
@@ -154,11 +181,15 @@
     <w:p>
       <w:pPr>
         <w:rPr>
-          <w:lang w:val="vi-VN"/>
-        </w:rPr>
-      </w:pPr>
-      <w:r>
-        <w:rPr>
+          <w:sz w:val="28"/>
+          <w:szCs w:val="28"/>
+          <w:lang w:val="vi-VN"/>
+        </w:rPr>
+      </w:pPr>
+      <w:r>
+        <w:rPr>
+          <w:sz w:val="28"/>
+          <w:szCs w:val="28"/>
           <w:lang w:val="vi-VN"/>
         </w:rPr>
         <w:t>Thiết bị : loại thiết bị, thông tin, chi phí bảo trì – tùy loại thiết bị</w:t>
@@ -167,11 +198,15 @@
     <w:p>
       <w:pPr>
         <w:rPr>
-          <w:lang w:val="vi-VN"/>
-        </w:rPr>
-      </w:pPr>
-      <w:r>
-        <w:rPr>
+          <w:sz w:val="28"/>
+          <w:szCs w:val="28"/>
+          <w:lang w:val="vi-VN"/>
+        </w:rPr>
+      </w:pPr>
+      <w:r>
+        <w:rPr>
+          <w:sz w:val="28"/>
+          <w:szCs w:val="28"/>
           <w:lang w:val="vi-VN"/>
         </w:rPr>
         <w:t>Khả năng: kết nối mạng,...</w:t>
@@ -180,18 +215,24 @@
     <w:p>
       <w:pPr>
         <w:rPr>
-          <w:lang w:val="vi-VN"/>
-        </w:rPr>
-      </w:pPr>
-    </w:p>
-    <w:p>
-      <w:pPr>
-        <w:rPr>
-          <w:lang w:val="vi-VN"/>
-        </w:rPr>
-      </w:pPr>
-      <w:r>
-        <w:rPr>
+          <w:sz w:val="28"/>
+          <w:szCs w:val="28"/>
+          <w:lang w:val="vi-VN"/>
+        </w:rPr>
+      </w:pPr>
+    </w:p>
+    <w:p>
+      <w:pPr>
+        <w:rPr>
+          <w:sz w:val="28"/>
+          <w:szCs w:val="28"/>
+          <w:lang w:val="vi-VN"/>
+        </w:rPr>
+      </w:pPr>
+      <w:r>
+        <w:rPr>
+          <w:sz w:val="28"/>
+          <w:szCs w:val="28"/>
           <w:lang w:val="vi-VN"/>
         </w:rPr>
         <w:t xml:space="preserve">2. </w:t>
@@ -200,35 +241,47 @@
     <w:p>
       <w:pPr>
         <w:rPr>
-          <w:lang w:val="vi-VN"/>
-        </w:rPr>
-      </w:pPr>
-      <w:r>
-        <w:rPr>
+          <w:sz w:val="28"/>
+          <w:szCs w:val="28"/>
+          <w:lang w:val="vi-VN"/>
+        </w:rPr>
+      </w:pPr>
+      <w:r>
+        <w:rPr>
+          <w:sz w:val="28"/>
+          <w:szCs w:val="28"/>
           <w:lang w:val="vi-VN"/>
         </w:rPr>
         <w:t xml:space="preserve">Xây dựng lớp trừu tượng Device </w:t>
       </w:r>
       <w:r>
         <w:rPr>
+          <w:sz w:val="28"/>
+          <w:szCs w:val="28"/>
           <w:lang w:val="vi-VN"/>
         </w:rPr>
         <w:t>--- &gt; 3 type</w:t>
       </w:r>
       <w:r>
         <w:rPr>
+          <w:sz w:val="28"/>
+          <w:szCs w:val="28"/>
           <w:lang w:val="vi-VN"/>
         </w:rPr>
         <w:t xml:space="preserve"> lớp dẫn xuất</w:t>
       </w:r>
       <w:r>
         <w:rPr>
+          <w:sz w:val="28"/>
+          <w:szCs w:val="28"/>
           <w:lang w:val="vi-VN"/>
         </w:rPr>
         <w:t xml:space="preserve"> : Printer, Computer, </w:t>
       </w:r>
       <w:r>
         <w:rPr>
+          <w:sz w:val="28"/>
+          <w:szCs w:val="28"/>
           <w:lang w:val="vi-VN"/>
         </w:rPr>
         <w:t>Projector</w:t>
@@ -237,17 +290,23 @@
     <w:p>
       <w:pPr>
         <w:rPr>
-          <w:lang w:val="vi-VN"/>
-        </w:rPr>
-      </w:pPr>
-      <w:r>
-        <w:rPr>
+          <w:sz w:val="28"/>
+          <w:szCs w:val="28"/>
+          <w:lang w:val="vi-VN"/>
+        </w:rPr>
+      </w:pPr>
+      <w:r>
+        <w:rPr>
+          <w:sz w:val="28"/>
+          <w:szCs w:val="28"/>
           <w:lang w:val="vi-VN"/>
         </w:rPr>
         <w:t xml:space="preserve">Thuộc tính Device: </w:t>
       </w:r>
       <w:r>
         <w:rPr>
+          <w:sz w:val="28"/>
+          <w:szCs w:val="28"/>
           <w:lang w:val="vi-VN"/>
         </w:rPr>
         <w:t>Mã , tên, giá, năm sử dụng, trạng thái</w:t>
@@ -256,23 +315,31 @@
     <w:p>
       <w:pPr>
         <w:rPr>
-          <w:lang w:val="vi-VN"/>
-        </w:rPr>
-      </w:pPr>
-      <w:r>
-        <w:rPr>
+          <w:sz w:val="28"/>
+          <w:szCs w:val="28"/>
+          <w:lang w:val="vi-VN"/>
+        </w:rPr>
+      </w:pPr>
+      <w:r>
+        <w:rPr>
+          <w:sz w:val="28"/>
+          <w:szCs w:val="28"/>
           <w:lang w:val="vi-VN"/>
         </w:rPr>
         <w:t xml:space="preserve">Mỗi lớp dẫn xuất </w:t>
       </w:r>
       <w:r>
         <w:rPr>
+          <w:sz w:val="28"/>
+          <w:szCs w:val="28"/>
           <w:lang w:val="vi-VN"/>
         </w:rPr>
         <w:t>bổ sung</w:t>
       </w:r>
       <w:r>
         <w:rPr>
+          <w:sz w:val="28"/>
+          <w:szCs w:val="28"/>
           <w:lang w:val="vi-VN"/>
         </w:rPr>
         <w:t xml:space="preserve"> thuộc tính riêng: </w:t>
@@ -281,11 +348,15 @@
     <w:p>
       <w:pPr>
         <w:rPr>
-          <w:lang w:val="vi-VN"/>
-        </w:rPr>
-      </w:pPr>
-      <w:r>
-        <w:rPr>
+          <w:sz w:val="28"/>
+          <w:szCs w:val="28"/>
+          <w:lang w:val="vi-VN"/>
+        </w:rPr>
+      </w:pPr>
+      <w:r>
+        <w:rPr>
+          <w:sz w:val="28"/>
+          <w:szCs w:val="28"/>
           <w:lang w:val="vi-VN"/>
         </w:rPr>
         <w:t>+ Printer:</w:t>
@@ -294,11 +365,15 @@
     <w:p>
       <w:pPr>
         <w:rPr>
-          <w:lang w:val="vi-VN"/>
-        </w:rPr>
-      </w:pPr>
-      <w:r>
-        <w:rPr>
+          <w:sz w:val="28"/>
+          <w:szCs w:val="28"/>
+          <w:lang w:val="vi-VN"/>
+        </w:rPr>
+      </w:pPr>
+      <w:r>
+        <w:rPr>
+          <w:sz w:val="28"/>
+          <w:szCs w:val="28"/>
           <w:lang w:val="vi-VN"/>
         </w:rPr>
         <w:t>+ Computer:</w:t>
@@ -307,23 +382,31 @@
     <w:p>
       <w:pPr>
         <w:rPr>
-          <w:lang w:val="vi-VN"/>
-        </w:rPr>
-      </w:pPr>
-      <w:r>
-        <w:rPr>
+          <w:sz w:val="28"/>
+          <w:szCs w:val="28"/>
+          <w:lang w:val="vi-VN"/>
+        </w:rPr>
+      </w:pPr>
+      <w:r>
+        <w:rPr>
+          <w:sz w:val="28"/>
+          <w:szCs w:val="28"/>
           <w:lang w:val="vi-VN"/>
         </w:rPr>
         <w:t>+</w:t>
       </w:r>
       <w:r>
         <w:rPr>
+          <w:sz w:val="28"/>
+          <w:szCs w:val="28"/>
           <w:lang w:val="vi-VN"/>
         </w:rPr>
         <w:t xml:space="preserve"> </w:t>
       </w:r>
       <w:r>
         <w:rPr>
+          <w:sz w:val="28"/>
+          <w:szCs w:val="28"/>
           <w:lang w:val="vi-VN"/>
         </w:rPr>
         <w:t xml:space="preserve">Projector: </w:t>
@@ -332,18 +415,32 @@
     <w:p>
       <w:pPr>
         <w:rPr>
-          <w:lang w:val="vi-VN"/>
-        </w:rPr>
-      </w:pPr>
-    </w:p>
-    <w:p>
-      <w:pPr>
-        <w:rPr>
-          <w:lang w:val="vi-VN"/>
-        </w:rPr>
-      </w:pPr>
-      <w:r>
-        <w:rPr>
+          <w:sz w:val="28"/>
+          <w:szCs w:val="28"/>
+          <w:lang w:val="vi-VN"/>
+        </w:rPr>
+      </w:pPr>
+      <w:r>
+        <w:rPr>
+          <w:sz w:val="28"/>
+          <w:szCs w:val="28"/>
+          <w:lang w:val="vi-VN"/>
+        </w:rPr>
+        <w:t xml:space="preserve">Xây method để tính chi phí Maintainance_Cost cho từng loại riêng. </w:t>
+      </w:r>
+    </w:p>
+    <w:p>
+      <w:pPr>
+        <w:rPr>
+          <w:sz w:val="28"/>
+          <w:szCs w:val="28"/>
+          <w:lang w:val="vi-VN"/>
+        </w:rPr>
+      </w:pPr>
+      <w:r>
+        <w:rPr>
+          <w:sz w:val="28"/>
+          <w:szCs w:val="28"/>
           <w:lang w:val="vi-VN"/>
         </w:rPr>
         <w:t xml:space="preserve">3. </w:t>
@@ -352,36 +449,15 @@
     <w:p>
       <w:pPr>
         <w:rPr>
-          <w:lang w:val="vi-VN"/>
-        </w:rPr>
-      </w:pPr>
-      <w:r>
-        <w:rPr>
-          <w:lang w:val="vi-VN"/>
-        </w:rPr>
-        <w:t xml:space="preserve">Xây interface để tính Chi phí bảo trì: </w:t>
-      </w:r>
-      <w:r>
-        <w:rPr>
-          <w:lang w:val="vi-VN"/>
-        </w:rPr>
-        <w:t>Maintainance_Cost()</w:t>
-      </w:r>
-      <w:r>
-        <w:rPr>
-          <w:lang w:val="vi-VN"/>
-        </w:rPr>
-        <w:t xml:space="preserve"> cho từng lớp dẫn xuất</w:t>
-      </w:r>
-    </w:p>
-    <w:p>
-      <w:pPr>
-        <w:rPr>
-          <w:lang w:val="vi-VN"/>
-        </w:rPr>
-      </w:pPr>
-      <w:r>
-        <w:rPr>
+          <w:sz w:val="28"/>
+          <w:szCs w:val="28"/>
+          <w:lang w:val="vi-VN"/>
+        </w:rPr>
+      </w:pPr>
+      <w:r>
+        <w:rPr>
+          <w:sz w:val="28"/>
+          <w:szCs w:val="28"/>
           <w:lang w:val="vi-VN"/>
         </w:rPr>
         <w:lastRenderedPageBreak/>
@@ -389,43 +465,81 @@
       </w:r>
       <w:r>
         <w:rPr>
+          <w:sz w:val="28"/>
+          <w:szCs w:val="28"/>
           <w:lang w:val="vi-VN"/>
         </w:rPr>
         <w:t>Printer, Compute</w:t>
       </w:r>
       <w:r>
         <w:rPr>
+          <w:sz w:val="28"/>
+          <w:szCs w:val="28"/>
           <w:lang w:val="vi-VN"/>
         </w:rPr>
         <w:t>r, Projector có những thiết bị có thể/ không thể nối mạng</w:t>
       </w:r>
       <w:r>
         <w:rPr>
+          <w:sz w:val="28"/>
+          <w:szCs w:val="28"/>
           <w:lang w:val="vi-VN"/>
         </w:rPr>
         <w:t>, ta xây interface cho khả năng kết nối mạng</w:t>
       </w:r>
-    </w:p>
-    <w:p>
-      <w:pPr>
-        <w:rPr>
-          <w:lang w:val="vi-VN"/>
-        </w:rPr>
-      </w:pPr>
-      <w:r>
-        <w:rPr>
+      <w:r>
+        <w:rPr>
+          <w:sz w:val="28"/>
+          <w:szCs w:val="28"/>
+          <w:lang w:val="vi-VN"/>
+        </w:rPr>
+        <w:t>.</w:t>
+      </w:r>
+    </w:p>
+    <w:p>
+      <w:pPr>
+        <w:rPr>
+          <w:sz w:val="28"/>
+          <w:szCs w:val="28"/>
+          <w:lang w:val="vi-VN"/>
+        </w:rPr>
+      </w:pPr>
+      <w:r>
+        <w:rPr>
+          <w:sz w:val="28"/>
+          <w:szCs w:val="28"/>
           <w:lang w:val="vi-VN"/>
         </w:rPr>
         <w:t xml:space="preserve">Xây interface </w:t>
       </w:r>
       <w:r>
         <w:rPr>
-          <w:lang w:val="vi-VN"/>
-        </w:rPr>
-        <w:t>Inetworkable</w:t>
-      </w:r>
-      <w:r>
-        <w:rPr>
+          <w:sz w:val="28"/>
+          <w:szCs w:val="28"/>
+          <w:lang w:val="vi-VN"/>
+        </w:rPr>
+        <w:t>I</w:t>
+      </w:r>
+      <w:r>
+        <w:rPr>
+          <w:sz w:val="28"/>
+          <w:szCs w:val="28"/>
+          <w:lang w:val="vi-VN"/>
+        </w:rPr>
+        <w:t>N</w:t>
+      </w:r>
+      <w:r>
+        <w:rPr>
+          <w:sz w:val="28"/>
+          <w:szCs w:val="28"/>
+          <w:lang w:val="vi-VN"/>
+        </w:rPr>
+        <w:t>etworkable</w:t>
+      </w:r>
+      <w:r>
+        <w:rPr>
+          <w:sz w:val="28"/>
+          <w:szCs w:val="28"/>
           <w:lang w:val="vi-VN"/>
         </w:rPr>
         <w:t xml:space="preserve"> </w:t>
@@ -434,11 +548,15 @@
     <w:p>
       <w:pPr>
         <w:rPr>
-          <w:lang w:val="vi-VN"/>
-        </w:rPr>
-      </w:pPr>
-      <w:r>
-        <w:rPr>
+          <w:sz w:val="28"/>
+          <w:szCs w:val="28"/>
+          <w:lang w:val="vi-VN"/>
+        </w:rPr>
+      </w:pPr>
+      <w:r>
+        <w:rPr>
+          <w:sz w:val="28"/>
+          <w:szCs w:val="28"/>
           <w:lang w:val="vi-VN"/>
         </w:rPr>
         <w:t>Lựa chọn tất cả các thiết bị có thể nối mạng, ngoại trừ 1 số Printer</w:t>
@@ -447,23 +565,71 @@
     <w:p>
       <w:pPr>
         <w:rPr>
-          <w:lang w:val="vi-VN"/>
-        </w:rPr>
-      </w:pPr>
-      <w:r>
-        <w:rPr>
-          <w:lang w:val="vi-VN"/>
-        </w:rPr>
-        <w:t>Giải pháp: Xây lớp NetworkPrinter từ Printer với cùng thuộc tính nhưng lớp NetworkPrinter có interface I</w:t>
-      </w:r>
-      <w:r>
-        <w:rPr>
-          <w:lang w:val="vi-VN"/>
-        </w:rPr>
-        <w:t>ne</w:t>
-      </w:r>
-      <w:r>
-        <w:rPr>
+          <w:sz w:val="28"/>
+          <w:szCs w:val="28"/>
+          <w:lang w:val="vi-VN"/>
+        </w:rPr>
+      </w:pPr>
+      <w:r>
+        <w:rPr>
+          <w:sz w:val="28"/>
+          <w:szCs w:val="28"/>
+          <w:lang w:val="vi-VN"/>
+        </w:rPr>
+        <w:t xml:space="preserve">Giải pháp: Xây lớp NetworkPrinter từ Printer </w:t>
+      </w:r>
+      <w:r>
+        <w:rPr>
+          <w:sz w:val="28"/>
+          <w:szCs w:val="28"/>
+          <w:lang w:val="vi-VN"/>
+        </w:rPr>
+        <w:t xml:space="preserve">kế thừa phần chung , </w:t>
+      </w:r>
+      <w:r>
+        <w:rPr>
+          <w:sz w:val="28"/>
+          <w:szCs w:val="28"/>
+          <w:lang w:val="vi-VN"/>
+        </w:rPr>
+        <w:t xml:space="preserve">nhưng lớp NetworkPrinter </w:t>
+      </w:r>
+      <w:r>
+        <w:rPr>
+          <w:sz w:val="28"/>
+          <w:szCs w:val="28"/>
+          <w:lang w:val="vi-VN"/>
+        </w:rPr>
+        <w:t>thực thi</w:t>
+      </w:r>
+      <w:r>
+        <w:rPr>
+          <w:sz w:val="28"/>
+          <w:szCs w:val="28"/>
+          <w:lang w:val="vi-VN"/>
+        </w:rPr>
+        <w:t xml:space="preserve"> interface I</w:t>
+      </w:r>
+      <w:r>
+        <w:rPr>
+          <w:sz w:val="28"/>
+          <w:szCs w:val="28"/>
+          <w:lang w:val="vi-VN"/>
+        </w:rPr>
+        <w:t>N</w:t>
+      </w:r>
+      <w:r>
+        <w:rPr>
+          <w:sz w:val="28"/>
+          <w:szCs w:val="28"/>
+          <w:lang w:val="vi-VN"/>
+        </w:rPr>
+        <w:t>e</w:t>
+      </w:r>
+      <w:r>
+        <w:rPr>
+          <w:sz w:val="28"/>
+          <w:szCs w:val="28"/>
           <w:lang w:val="vi-VN"/>
         </w:rPr>
         <w:t>tworkable</w:t>
@@ -472,39 +638,157 @@
     <w:p>
       <w:pPr>
         <w:rPr>
-          <w:lang w:val="vi-VN"/>
-        </w:rPr>
-      </w:pPr>
-    </w:p>
-    <w:p>
-      <w:pPr>
-        <w:rPr>
-          <w:lang w:val="vi-VN"/>
-        </w:rPr>
-      </w:pPr>
-    </w:p>
-    <w:p>
-      <w:pPr>
-        <w:rPr>
-          <w:lang w:val="vi-VN"/>
-        </w:rPr>
-      </w:pPr>
-    </w:p>
-    <w:p>
-      <w:pPr>
-        <w:rPr>
-          <w:lang w:val="vi-VN"/>
-        </w:rPr>
-      </w:pPr>
-    </w:p>
-    <w:p>
-      <w:pPr>
-        <w:rPr>
-          <w:lang w:val="vi-VN"/>
-        </w:rPr>
-      </w:pPr>
-      <w:r>
-        <w:rPr>
+          <w:sz w:val="28"/>
+          <w:szCs w:val="28"/>
+          <w:lang w:val="vi-VN"/>
+        </w:rPr>
+      </w:pPr>
+      <w:r>
+        <w:rPr>
+          <w:sz w:val="28"/>
+          <w:szCs w:val="28"/>
+          <w:lang w:val="vi-VN"/>
+        </w:rPr>
+        <w:t xml:space="preserve">Đánh đổi: </w:t>
+      </w:r>
+      <w:r>
+        <w:rPr>
+          <w:sz w:val="28"/>
+          <w:szCs w:val="28"/>
+          <w:lang w:val="vi-VN"/>
+        </w:rPr>
+        <w:t xml:space="preserve">+) </w:t>
+      </w:r>
+      <w:r>
+        <w:rPr>
+          <w:sz w:val="28"/>
+          <w:szCs w:val="28"/>
+          <w:lang w:val="vi-VN"/>
+        </w:rPr>
+        <w:t>Xây dựng 1 lớp mới tăng sự phụ thuộc vào lớp Printe</w:t>
+      </w:r>
+      <w:r>
+        <w:rPr>
+          <w:sz w:val="28"/>
+          <w:szCs w:val="28"/>
+          <w:lang w:val="vi-VN"/>
+        </w:rPr>
+        <w:t xml:space="preserve">r. </w:t>
+      </w:r>
+    </w:p>
+    <w:p>
+      <w:pPr>
+        <w:rPr>
+          <w:sz w:val="28"/>
+          <w:szCs w:val="28"/>
+          <w:lang w:val="vi-VN"/>
+        </w:rPr>
+      </w:pPr>
+      <w:r>
+        <w:rPr>
+          <w:sz w:val="28"/>
+          <w:szCs w:val="28"/>
+          <w:lang w:val="vi-VN"/>
+        </w:rPr>
+        <w:t>+) K</w:t>
+      </w:r>
+      <w:r>
+        <w:rPr>
+          <w:sz w:val="28"/>
+          <w:szCs w:val="28"/>
+          <w:lang w:val="vi-VN"/>
+        </w:rPr>
+        <w:t>hi bổ sung phương thức nào mới như kết nối mạng LAN có thể gây xung độ</w:t>
+      </w:r>
+      <w:r>
+        <w:rPr>
+          <w:sz w:val="28"/>
+          <w:szCs w:val="28"/>
+          <w:lang w:val="vi-VN"/>
+        </w:rPr>
+        <w:t>t cho khả năng của NetworkPrinter</w:t>
+      </w:r>
+      <w:r>
+        <w:rPr>
+          <w:sz w:val="28"/>
+          <w:szCs w:val="28"/>
+          <w:lang w:val="vi-VN"/>
+        </w:rPr>
+        <w:t>.</w:t>
+      </w:r>
+      <w:r>
+        <w:rPr>
+          <w:sz w:val="28"/>
+          <w:szCs w:val="28"/>
+          <w:lang w:val="vi-VN"/>
+        </w:rPr>
+        <w:t xml:space="preserve"> </w:t>
+      </w:r>
+    </w:p>
+    <w:p>
+      <w:pPr>
+        <w:rPr>
+          <w:sz w:val="28"/>
+          <w:szCs w:val="28"/>
+          <w:lang w:val="vi-VN"/>
+        </w:rPr>
+      </w:pPr>
+      <w:r>
+        <w:rPr>
+          <w:sz w:val="28"/>
+          <w:szCs w:val="28"/>
+          <w:lang w:val="vi-VN"/>
+        </w:rPr>
+        <w:t xml:space="preserve">+) Hoặc nâng cấp Printer có thể nối mạng gây ra nạp chồng phương thức cho NetworkPrinter.  </w:t>
+      </w:r>
+      <w:r>
+        <w:rPr>
+          <w:sz w:val="28"/>
+          <w:szCs w:val="28"/>
+          <w:lang w:val="vi-VN"/>
+        </w:rPr>
+        <w:t xml:space="preserve"> </w:t>
+      </w:r>
+    </w:p>
+    <w:p>
+      <w:pPr>
+        <w:rPr>
+          <w:sz w:val="28"/>
+          <w:szCs w:val="28"/>
+          <w:lang w:val="vi-VN"/>
+        </w:rPr>
+      </w:pPr>
+    </w:p>
+    <w:p>
+      <w:pPr>
+        <w:rPr>
+          <w:sz w:val="28"/>
+          <w:szCs w:val="28"/>
+          <w:lang w:val="vi-VN"/>
+        </w:rPr>
+      </w:pPr>
+    </w:p>
+    <w:p>
+      <w:pPr>
+        <w:rPr>
+          <w:sz w:val="28"/>
+          <w:szCs w:val="28"/>
+          <w:lang w:val="vi-VN"/>
+        </w:rPr>
+      </w:pPr>
+    </w:p>
+    <w:p>
+      <w:pPr>
+        <w:rPr>
+          <w:sz w:val="28"/>
+          <w:szCs w:val="28"/>
+          <w:lang w:val="vi-VN"/>
+        </w:rPr>
+      </w:pPr>
+      <w:r>
+        <w:rPr>
+          <w:sz w:val="28"/>
+          <w:szCs w:val="28"/>
           <w:lang w:val="vi-VN"/>
         </w:rPr>
         <w:t xml:space="preserve">5. </w:t>
@@ -513,11 +797,15 @@
     <w:p>
       <w:pPr>
         <w:rPr>
-          <w:lang w:val="vi-VN"/>
-        </w:rPr>
-      </w:pPr>
-      <w:r>
-        <w:rPr>
+          <w:sz w:val="28"/>
+          <w:szCs w:val="28"/>
+          <w:lang w:val="vi-VN"/>
+        </w:rPr>
+      </w:pPr>
+      <w:r>
+        <w:rPr>
+          <w:sz w:val="28"/>
+          <w:szCs w:val="28"/>
           <w:lang w:val="vi-VN"/>
         </w:rPr>
         <w:t xml:space="preserve">Xây dựng lớp LabRoom </w:t>
@@ -526,11 +814,15 @@
     <w:p>
       <w:pPr>
         <w:rPr>
-          <w:lang w:val="vi-VN"/>
-        </w:rPr>
-      </w:pPr>
-      <w:r>
-        <w:rPr>
+          <w:sz w:val="28"/>
+          <w:szCs w:val="28"/>
+          <w:lang w:val="vi-VN"/>
+        </w:rPr>
+      </w:pPr>
+      <w:r>
+        <w:rPr>
+          <w:sz w:val="28"/>
+          <w:szCs w:val="28"/>
           <w:lang w:val="vi-VN"/>
         </w:rPr>
         <w:t>Thuộc tính: mã phòng, tên, sức chứa, Danh sách thiết bị</w:t>
@@ -539,18 +831,24 @@
     <w:p>
       <w:pPr>
         <w:rPr>
-          <w:lang w:val="vi-VN"/>
-        </w:rPr>
-      </w:pPr>
-    </w:p>
-    <w:p>
-      <w:pPr>
-        <w:rPr>
-          <w:lang w:val="vi-VN"/>
-        </w:rPr>
-      </w:pPr>
-      <w:r>
-        <w:rPr>
+          <w:sz w:val="28"/>
+          <w:szCs w:val="28"/>
+          <w:lang w:val="vi-VN"/>
+        </w:rPr>
+      </w:pPr>
+    </w:p>
+    <w:p>
+      <w:pPr>
+        <w:rPr>
+          <w:sz w:val="28"/>
+          <w:szCs w:val="28"/>
+          <w:lang w:val="vi-VN"/>
+        </w:rPr>
+      </w:pPr>
+      <w:r>
+        <w:rPr>
+          <w:sz w:val="28"/>
+          <w:szCs w:val="28"/>
           <w:lang w:val="vi-VN"/>
         </w:rPr>
         <w:t>Phương thức để kiểm soát danh sách: add, remove , Calculate_Maintainance_Cost</w:t>
@@ -559,37 +857,134 @@
     <w:p>
       <w:pPr>
         <w:rPr>
-          <w:lang w:val="vi-VN"/>
-        </w:rPr>
-      </w:pPr>
-      <w:r>
-        <w:rPr>
-          <w:lang w:val="vi-VN"/>
-        </w:rPr>
-        <w:t>Đặc biệt Calculate_Maintainace_Cost lấy Obj.Maintainace_Cost để tính</w:t>
-      </w:r>
-    </w:p>
-    <w:p>
-      <w:pPr>
-        <w:rPr>
-          <w:lang w:val="vi-VN"/>
-        </w:rPr>
-      </w:pPr>
-    </w:p>
-    <w:p>
-      <w:pPr>
-        <w:rPr>
-          <w:lang w:val="vi-VN"/>
-        </w:rPr>
-      </w:pPr>
-      <w:r>
-        <w:rPr>
-          <w:lang w:val="vi-VN"/>
-        </w:rPr>
-        <w:t>Lớp LabRoom và Device là quan hệ lỏng. Device là 1 lớp độc lập.  Khi add Device vào LabRoom, xóa LabRoom ko ảnh hưởng</w:t>
-      </w:r>
-      <w:r>
-        <w:rPr>
+          <w:sz w:val="28"/>
+          <w:szCs w:val="28"/>
+          <w:lang w:val="vi-VN"/>
+        </w:rPr>
+      </w:pPr>
+      <w:r>
+        <w:rPr>
+          <w:sz w:val="28"/>
+          <w:szCs w:val="28"/>
+          <w:lang w:val="vi-VN"/>
+        </w:rPr>
+        <w:t>Đặc biệt Calculate_Maintainace_Cost lấy Obj.Maintainace_Cos</w:t>
+      </w:r>
+      <w:r>
+        <w:rPr>
+          <w:sz w:val="28"/>
+          <w:szCs w:val="28"/>
+          <w:lang w:val="vi-VN"/>
+        </w:rPr>
+        <w:t>t</w:t>
+      </w:r>
+    </w:p>
+    <w:p>
+      <w:pPr>
+        <w:rPr>
+          <w:sz w:val="28"/>
+          <w:szCs w:val="28"/>
+          <w:lang w:val="vi-VN"/>
+        </w:rPr>
+      </w:pPr>
+      <w:r>
+        <w:rPr>
+          <w:sz w:val="28"/>
+          <w:szCs w:val="28"/>
+          <w:lang w:val="vi-VN"/>
+        </w:rPr>
+        <w:t xml:space="preserve">Vì Obj kiểu Device, Device tham chiếu type: Printer, Computer, Projector. Device có Maintainance_Cost đã khai báo, nhưng tham chiếu interface ghi đè. </w:t>
+      </w:r>
+    </w:p>
+    <w:p>
+      <w:pPr>
+        <w:rPr>
+          <w:sz w:val="28"/>
+          <w:szCs w:val="28"/>
+          <w:lang w:val="vi-VN"/>
+        </w:rPr>
+      </w:pPr>
+    </w:p>
+    <w:p>
+      <w:pPr>
+        <w:rPr>
+          <w:sz w:val="28"/>
+          <w:szCs w:val="28"/>
+          <w:lang w:val="vi-VN"/>
+        </w:rPr>
+      </w:pPr>
+    </w:p>
+    <w:p>
+      <w:pPr>
+        <w:rPr>
+          <w:sz w:val="28"/>
+          <w:szCs w:val="28"/>
+          <w:lang w:val="vi-VN"/>
+        </w:rPr>
+      </w:pPr>
+      <w:r>
+        <w:rPr>
+          <w:sz w:val="28"/>
+          <w:szCs w:val="28"/>
+          <w:lang w:val="vi-VN"/>
+        </w:rPr>
+        <w:lastRenderedPageBreak/>
+        <w:t>Lớp LabRoom và Device là quan hệ lỏng</w:t>
+      </w:r>
+      <w:r>
+        <w:rPr>
+          <w:sz w:val="28"/>
+          <w:szCs w:val="28"/>
+          <w:lang w:val="vi-VN"/>
+        </w:rPr>
+        <w:t xml:space="preserve"> với LabRoom bao hàm Device</w:t>
+      </w:r>
+      <w:r>
+        <w:rPr>
+          <w:sz w:val="28"/>
+          <w:szCs w:val="28"/>
+          <w:lang w:val="vi-VN"/>
+        </w:rPr>
+        <w:t xml:space="preserve">. </w:t>
+      </w:r>
+    </w:p>
+    <w:p>
+      <w:pPr>
+        <w:rPr>
+          <w:sz w:val="28"/>
+          <w:szCs w:val="28"/>
+          <w:lang w:val="vi-VN"/>
+        </w:rPr>
+      </w:pPr>
+      <w:r>
+        <w:rPr>
+          <w:sz w:val="28"/>
+          <w:szCs w:val="28"/>
+          <w:lang w:val="vi-VN"/>
+        </w:rPr>
+        <w:t xml:space="preserve">Trong thực tế, Device không biến mất khi LabRoom không còn tồn tại. </w:t>
+      </w:r>
+    </w:p>
+    <w:p>
+      <w:pPr>
+        <w:rPr>
+          <w:sz w:val="28"/>
+          <w:szCs w:val="28"/>
+          <w:lang w:val="vi-VN"/>
+        </w:rPr>
+      </w:pPr>
+      <w:r>
+        <w:rPr>
+          <w:sz w:val="28"/>
+          <w:szCs w:val="28"/>
+          <w:lang w:val="vi-VN"/>
+        </w:rPr>
+        <w:t>Device là 1 lớp độc lập.  Khi add Device vào LabRoom, xóa LabRoom ko ảnh hưởng</w:t>
+      </w:r>
+      <w:r>
+        <w:rPr>
+          <w:sz w:val="28"/>
+          <w:szCs w:val="28"/>
           <w:lang w:val="vi-VN"/>
         </w:rPr>
         <w:t xml:space="preserve"> Device</w:t>
@@ -598,11 +993,15 @@
     <w:p>
       <w:pPr>
         <w:rPr>
-          <w:lang w:val="vi-VN"/>
-        </w:rPr>
-      </w:pPr>
-      <w:r>
-        <w:rPr>
+          <w:sz w:val="28"/>
+          <w:szCs w:val="28"/>
+          <w:lang w:val="vi-VN"/>
+        </w:rPr>
+      </w:pPr>
+      <w:r>
+        <w:rPr>
+          <w:sz w:val="28"/>
+          <w:szCs w:val="28"/>
           <w:lang w:val="vi-VN"/>
         </w:rPr>
         <w:t>Kết tập : quan hệ lỏng</w:t>
@@ -611,76 +1010,98 @@
     <w:p>
       <w:pPr>
         <w:rPr>
-          <w:lang w:val="vi-VN"/>
-        </w:rPr>
-      </w:pPr>
-    </w:p>
-    <w:p>
-      <w:pPr>
-        <w:rPr>
-          <w:lang w:val="vi-VN"/>
-        </w:rPr>
-      </w:pPr>
-    </w:p>
-    <w:p>
-      <w:pPr>
-        <w:rPr>
-          <w:lang w:val="vi-VN"/>
-        </w:rPr>
-      </w:pPr>
-    </w:p>
-    <w:p>
-      <w:pPr>
-        <w:rPr>
-          <w:lang w:val="vi-VN"/>
-        </w:rPr>
-      </w:pPr>
-    </w:p>
-    <w:p>
-      <w:pPr>
-        <w:rPr>
-          <w:lang w:val="vi-VN"/>
-        </w:rPr>
-      </w:pPr>
-    </w:p>
-    <w:p>
-      <w:pPr>
-        <w:rPr>
-          <w:lang w:val="vi-VN"/>
-        </w:rPr>
-      </w:pPr>
-    </w:p>
-    <w:p>
-      <w:pPr>
-        <w:rPr>
-          <w:lang w:val="vi-VN"/>
-        </w:rPr>
-      </w:pPr>
-    </w:p>
-    <w:p>
-      <w:pPr>
-        <w:rPr>
-          <w:lang w:val="vi-VN"/>
-        </w:rPr>
-      </w:pPr>
-    </w:p>
-    <w:p>
-      <w:pPr>
-        <w:rPr>
-          <w:lang w:val="vi-VN"/>
-        </w:rPr>
-      </w:pPr>
-    </w:p>
-    <w:p>
-      <w:pPr>
-        <w:rPr>
-          <w:lang w:val="vi-VN"/>
-        </w:rPr>
-      </w:pPr>
-    </w:p>
-    <w:p>
-      <w:pPr>
-        <w:rPr>
+          <w:sz w:val="28"/>
+          <w:szCs w:val="28"/>
+          <w:lang w:val="vi-VN"/>
+        </w:rPr>
+      </w:pPr>
+    </w:p>
+    <w:p>
+      <w:pPr>
+        <w:rPr>
+          <w:sz w:val="28"/>
+          <w:szCs w:val="28"/>
+          <w:lang w:val="vi-VN"/>
+        </w:rPr>
+      </w:pPr>
+    </w:p>
+    <w:p>
+      <w:pPr>
+        <w:rPr>
+          <w:sz w:val="28"/>
+          <w:szCs w:val="28"/>
+          <w:lang w:val="vi-VN"/>
+        </w:rPr>
+      </w:pPr>
+    </w:p>
+    <w:p>
+      <w:pPr>
+        <w:rPr>
+          <w:sz w:val="28"/>
+          <w:szCs w:val="28"/>
+          <w:lang w:val="vi-VN"/>
+        </w:rPr>
+      </w:pPr>
+    </w:p>
+    <w:p>
+      <w:pPr>
+        <w:rPr>
+          <w:sz w:val="28"/>
+          <w:szCs w:val="28"/>
+          <w:lang w:val="vi-VN"/>
+        </w:rPr>
+      </w:pPr>
+    </w:p>
+    <w:p>
+      <w:pPr>
+        <w:rPr>
+          <w:sz w:val="28"/>
+          <w:szCs w:val="28"/>
+          <w:lang w:val="vi-VN"/>
+        </w:rPr>
+      </w:pPr>
+    </w:p>
+    <w:p>
+      <w:pPr>
+        <w:rPr>
+          <w:sz w:val="28"/>
+          <w:szCs w:val="28"/>
+          <w:lang w:val="vi-VN"/>
+        </w:rPr>
+      </w:pPr>
+    </w:p>
+    <w:p>
+      <w:pPr>
+        <w:rPr>
+          <w:sz w:val="28"/>
+          <w:szCs w:val="28"/>
+          <w:lang w:val="vi-VN"/>
+        </w:rPr>
+      </w:pPr>
+    </w:p>
+    <w:p>
+      <w:pPr>
+        <w:rPr>
+          <w:sz w:val="28"/>
+          <w:szCs w:val="28"/>
+          <w:lang w:val="vi-VN"/>
+        </w:rPr>
+      </w:pPr>
+    </w:p>
+    <w:p>
+      <w:pPr>
+        <w:rPr>
+          <w:sz w:val="28"/>
+          <w:szCs w:val="28"/>
+          <w:lang w:val="vi-VN"/>
+        </w:rPr>
+      </w:pPr>
+    </w:p>
+    <w:p>
+      <w:pPr>
+        <w:rPr>
+          <w:sz w:val="28"/>
+          <w:szCs w:val="28"/>
           <w:lang w:val="vi-VN"/>
         </w:rPr>
       </w:pPr>
@@ -1612,6 +2033,29 @@
       <w:spacing w:val="5"/>
     </w:rPr>
   </w:style>
+  <w:style w:type="character" w:styleId="Hyperlink">
+    <w:name w:val="Hyperlink"/>
+    <w:basedOn w:val="DefaultParagraphFont"/>
+    <w:uiPriority w:val="99"/>
+    <w:unhideWhenUsed/>
+    <w:rsid w:val="00834EDC"/>
+    <w:rPr>
+      <w:color w:val="467886" w:themeColor="hyperlink"/>
+      <w:u w:val="single"/>
+    </w:rPr>
+  </w:style>
+  <w:style w:type="character" w:styleId="UnresolvedMention">
+    <w:name w:val="Unresolved Mention"/>
+    <w:basedOn w:val="DefaultParagraphFont"/>
+    <w:uiPriority w:val="99"/>
+    <w:semiHidden/>
+    <w:unhideWhenUsed/>
+    <w:rsid w:val="00834EDC"/>
+    <w:rPr>
+      <w:color w:val="605E5C"/>
+      <w:shd w:val="clear" w:color="auto" w:fill="E1DFDD"/>
+    </w:rPr>
+  </w:style>
 </w:styles>
 </file>
 

</xml_diff>

<commit_message>
final fix 1: System Draft
</commit_message>
<xml_diff>
--- a/Report05.docx
+++ b/Report05.docx
@@ -426,24 +426,47 @@
           <w:szCs w:val="28"/>
           <w:lang w:val="vi-VN"/>
         </w:rPr>
-        <w:t xml:space="preserve">Xây method để tính chi phí Maintainance_Cost cho từng loại riêng. </w:t>
-      </w:r>
-    </w:p>
-    <w:p>
-      <w:pPr>
-        <w:rPr>
-          <w:sz w:val="28"/>
-          <w:szCs w:val="28"/>
-          <w:lang w:val="vi-VN"/>
-        </w:rPr>
-      </w:pPr>
-      <w:r>
-        <w:rPr>
-          <w:sz w:val="28"/>
-          <w:szCs w:val="28"/>
-          <w:lang w:val="vi-VN"/>
-        </w:rPr>
-        <w:t xml:space="preserve">3. </w:t>
+        <w:t>Xây method</w:t>
+      </w:r>
+      <w:r>
+        <w:rPr>
+          <w:sz w:val="28"/>
+          <w:szCs w:val="28"/>
+          <w:lang w:val="vi-VN"/>
+        </w:rPr>
+        <w:t xml:space="preserve"> trừu tượng</w:t>
+      </w:r>
+      <w:r>
+        <w:rPr>
+          <w:sz w:val="28"/>
+          <w:szCs w:val="28"/>
+          <w:lang w:val="vi-VN"/>
+        </w:rPr>
+        <w:t xml:space="preserve"> </w:t>
+      </w:r>
+      <w:r>
+        <w:rPr>
+          <w:sz w:val="28"/>
+          <w:szCs w:val="28"/>
+          <w:lang w:val="vi-VN"/>
+        </w:rPr>
+        <w:t>Maintainance_Cost</w:t>
+      </w:r>
+      <w:r>
+        <w:rPr>
+          <w:sz w:val="28"/>
+          <w:szCs w:val="28"/>
+          <w:lang w:val="vi-VN"/>
+        </w:rPr>
+        <w:t xml:space="preserve"> và ghi đè</w:t>
+      </w:r>
+      <w:r>
+        <w:rPr>
+          <w:sz w:val="28"/>
+          <w:szCs w:val="28"/>
+          <w:lang w:val="vi-VN"/>
+        </w:rPr>
+        <w:t xml:space="preserve"> để tính chi phí cho từng loại riêng. </w:t>
       </w:r>
     </w:p>
     <w:p>
@@ -461,6 +484,39 @@
           <w:lang w:val="vi-VN"/>
         </w:rPr>
         <w:lastRenderedPageBreak/>
+        <w:t>3</w:t>
+      </w:r>
+      <w:r>
+        <w:rPr>
+          <w:sz w:val="28"/>
+          <w:szCs w:val="28"/>
+          <w:lang w:val="vi-VN"/>
+        </w:rPr>
+        <w:t>,4</w:t>
+      </w:r>
+      <w:r>
+        <w:rPr>
+          <w:sz w:val="28"/>
+          <w:szCs w:val="28"/>
+          <w:lang w:val="vi-VN"/>
+        </w:rPr>
+        <w:t xml:space="preserve">. </w:t>
+      </w:r>
+    </w:p>
+    <w:p>
+      <w:pPr>
+        <w:rPr>
+          <w:sz w:val="28"/>
+          <w:szCs w:val="28"/>
+          <w:lang w:val="vi-VN"/>
+        </w:rPr>
+      </w:pPr>
+      <w:r>
+        <w:rPr>
+          <w:sz w:val="28"/>
+          <w:szCs w:val="28"/>
+          <w:lang w:val="vi-VN"/>
+        </w:rPr>
         <w:t xml:space="preserve">Vì </w:t>
       </w:r>
       <w:r>
@@ -724,30 +780,46 @@
         </w:rPr>
         <w:t xml:space="preserve"> </w:t>
       </w:r>
-    </w:p>
-    <w:p>
-      <w:pPr>
-        <w:rPr>
-          <w:sz w:val="28"/>
-          <w:szCs w:val="28"/>
-          <w:lang w:val="vi-VN"/>
-        </w:rPr>
-      </w:pPr>
-      <w:r>
-        <w:rPr>
-          <w:sz w:val="28"/>
-          <w:szCs w:val="28"/>
-          <w:lang w:val="vi-VN"/>
-        </w:rPr>
-        <w:t xml:space="preserve">+) Hoặc nâng cấp Printer có thể nối mạng gây ra nạp chồng phương thức cho NetworkPrinter.  </w:t>
-      </w:r>
-      <w:r>
-        <w:rPr>
-          <w:sz w:val="28"/>
-          <w:szCs w:val="28"/>
-          <w:lang w:val="vi-VN"/>
-        </w:rPr>
-        <w:t xml:space="preserve"> </w:t>
+      <w:r>
+        <w:rPr>
+          <w:sz w:val="28"/>
+          <w:szCs w:val="28"/>
+          <w:lang w:val="vi-VN"/>
+        </w:rPr>
+        <w:sym w:font="Wingdings" w:char="F0E0"/>
+      </w:r>
+      <w:r>
+        <w:rPr>
+          <w:sz w:val="28"/>
+          <w:szCs w:val="28"/>
+          <w:lang w:val="vi-VN"/>
+        </w:rPr>
+        <w:t xml:space="preserve"> có thể gây xung đột cho hành vi do 2 phương thức thực hiện song song mà chưa có driver chung (common sense)</w:t>
+      </w:r>
+    </w:p>
+    <w:p>
+      <w:pPr>
+        <w:rPr>
+          <w:sz w:val="28"/>
+          <w:szCs w:val="28"/>
+          <w:lang w:val="vi-VN"/>
+        </w:rPr>
+      </w:pPr>
+      <w:r>
+        <w:rPr>
+          <w:sz w:val="28"/>
+          <w:szCs w:val="28"/>
+          <w:lang w:val="vi-VN"/>
+        </w:rPr>
+        <w:t>+) Hoặc nâng cấp Printer có thể nối mạng</w:t>
+      </w:r>
+      <w:r>
+        <w:rPr>
+          <w:sz w:val="28"/>
+          <w:szCs w:val="28"/>
+          <w:lang w:val="vi-VN"/>
+        </w:rPr>
+        <w:t xml:space="preserve">. Điều này đặt câu hỏi về sự cần thiết của lớp NetworkPrinter. </w:t>
       </w:r>
     </w:p>
     <w:p>
@@ -893,42 +965,89 @@
           <w:szCs w:val="28"/>
           <w:lang w:val="vi-VN"/>
         </w:rPr>
-        <w:t xml:space="preserve">Vì Obj kiểu Device, Device tham chiếu type: Printer, Computer, Projector. Device có Maintainance_Cost đã khai báo, nhưng tham chiếu interface ghi đè. </w:t>
-      </w:r>
-    </w:p>
-    <w:p>
-      <w:pPr>
-        <w:rPr>
-          <w:sz w:val="28"/>
-          <w:szCs w:val="28"/>
-          <w:lang w:val="vi-VN"/>
-        </w:rPr>
-      </w:pPr>
-    </w:p>
-    <w:p>
-      <w:pPr>
-        <w:rPr>
-          <w:sz w:val="28"/>
-          <w:szCs w:val="28"/>
-          <w:lang w:val="vi-VN"/>
-        </w:rPr>
-      </w:pPr>
-    </w:p>
-    <w:p>
-      <w:pPr>
-        <w:rPr>
-          <w:sz w:val="28"/>
-          <w:szCs w:val="28"/>
-          <w:lang w:val="vi-VN"/>
-        </w:rPr>
-      </w:pPr>
-      <w:r>
-        <w:rPr>
-          <w:sz w:val="28"/>
-          <w:szCs w:val="28"/>
-          <w:lang w:val="vi-VN"/>
-        </w:rPr>
-        <w:lastRenderedPageBreak/>
+        <w:t xml:space="preserve">Vì Obj kiểu Device, </w:t>
+      </w:r>
+      <w:r>
+        <w:rPr>
+          <w:sz w:val="28"/>
+          <w:szCs w:val="28"/>
+          <w:lang w:val="vi-VN"/>
+        </w:rPr>
+        <w:t>Obj</w:t>
+      </w:r>
+      <w:r>
+        <w:rPr>
+          <w:sz w:val="28"/>
+          <w:szCs w:val="28"/>
+          <w:lang w:val="vi-VN"/>
+        </w:rPr>
+        <w:t xml:space="preserve"> tham chiếu </w:t>
+      </w:r>
+      <w:r>
+        <w:rPr>
+          <w:sz w:val="28"/>
+          <w:szCs w:val="28"/>
+          <w:lang w:val="vi-VN"/>
+        </w:rPr>
+        <w:t>đối tượng</w:t>
+      </w:r>
+      <w:r>
+        <w:rPr>
+          <w:sz w:val="28"/>
+          <w:szCs w:val="28"/>
+          <w:lang w:val="vi-VN"/>
+        </w:rPr>
+        <w:t xml:space="preserve">: Printer, Computer, Projector. Device có Maintainance_Cost đã khai báo, </w:t>
+      </w:r>
+      <w:r>
+        <w:rPr>
+          <w:sz w:val="28"/>
+          <w:szCs w:val="28"/>
+          <w:lang w:val="vi-VN"/>
+        </w:rPr>
+        <w:t xml:space="preserve">và lớp con </w:t>
+      </w:r>
+      <w:r>
+        <w:rPr>
+          <w:sz w:val="28"/>
+          <w:szCs w:val="28"/>
+          <w:lang w:val="vi-VN"/>
+        </w:rPr>
+        <w:t xml:space="preserve">ghi đè. </w:t>
+      </w:r>
+    </w:p>
+    <w:p>
+      <w:pPr>
+        <w:rPr>
+          <w:sz w:val="28"/>
+          <w:szCs w:val="28"/>
+          <w:lang w:val="vi-VN"/>
+        </w:rPr>
+      </w:pPr>
+    </w:p>
+    <w:p>
+      <w:pPr>
+        <w:rPr>
+          <w:sz w:val="28"/>
+          <w:szCs w:val="28"/>
+          <w:lang w:val="vi-VN"/>
+        </w:rPr>
+      </w:pPr>
+    </w:p>
+    <w:p>
+      <w:pPr>
+        <w:rPr>
+          <w:sz w:val="28"/>
+          <w:szCs w:val="28"/>
+          <w:lang w:val="vi-VN"/>
+        </w:rPr>
+      </w:pPr>
+      <w:r>
+        <w:rPr>
+          <w:sz w:val="28"/>
+          <w:szCs w:val="28"/>
+          <w:lang w:val="vi-VN"/>
+        </w:rPr>
         <w:t>Lớp LabRoom và Device là quan hệ lỏng</w:t>
       </w:r>
       <w:r>
@@ -979,15 +1098,23 @@
           <w:szCs w:val="28"/>
           <w:lang w:val="vi-VN"/>
         </w:rPr>
-        <w:t>Device là 1 lớp độc lập.  Khi add Device vào LabRoom, xóa LabRoom ko ảnh hưởng</w:t>
-      </w:r>
-      <w:r>
-        <w:rPr>
-          <w:sz w:val="28"/>
-          <w:szCs w:val="28"/>
-          <w:lang w:val="vi-VN"/>
-        </w:rPr>
-        <w:t xml:space="preserve"> Device</w:t>
+        <w:t>Sự tồn tại của</w:t>
+      </w:r>
+      <w:r>
+        <w:rPr>
+          <w:sz w:val="28"/>
+          <w:szCs w:val="28"/>
+          <w:lang w:val="vi-VN"/>
+        </w:rPr>
+        <w:t xml:space="preserve"> Obj</w:t>
+      </w:r>
+      <w:r>
+        <w:rPr>
+          <w:sz w:val="28"/>
+          <w:szCs w:val="28"/>
+          <w:lang w:val="vi-VN"/>
+        </w:rPr>
+        <w:t xml:space="preserve"> thiết bị không phụ thuộc vào sự tồn tại của phòng. </w:t>
       </w:r>
     </w:p>
     <w:p>

</xml_diff>